<commit_message>
docs: actualizar documentos con el historial del repositorio
</commit_message>
<xml_diff>
--- a/documentos/fase2/07_Repositorio_GitHub.docx
+++ b/documentos/fase2/07_Repositorio_GitHub.docx
@@ -1317,7 +1317,7 @@
           <w:rStyle w:val="VerbatimChar"/>
           <w:lang w:val="es-CO"/>
         </w:rPr>
-        <w:t xml:space="preserve">git log --format='%h | %an | %s'</w:t>
+        <w:t xml:space="preserve">git log --reverse --format='%h | %an | %s'</w:t>
       </w:r>
       <w:r>
         <w:rPr>
@@ -1429,7 +1429,7 @@
                 <w:sz w:val="19"/>
                 <w:lang w:val="es-CO"/>
               </w:rPr>
-              <w:t xml:space="preserve">a6b67bd</w:t>
+              <w:t xml:space="preserve">fb00ade</w:t>
             </w:r>
           </w:p>
         </w:tc>
@@ -1459,7 +1459,7 @@
                 <w:sz w:val="19"/>
                 <w:lang w:val="es-CO"/>
               </w:rPr>
-              <w:t xml:space="preserve">chore: especificación del proyecto, .gitignore y README principal</w:t>
+              <w:t xml:space="preserve">chore: estructura inicial del proyecto y README</w:t>
             </w:r>
           </w:p>
         </w:tc>
@@ -1476,7 +1476,7 @@
                 <w:sz w:val="19"/>
                 <w:lang w:val="es-CO"/>
               </w:rPr>
-              <w:t xml:space="preserve">920b6c5</w:t>
+              <w:t xml:space="preserve">c445b59</w:t>
             </w:r>
           </w:p>
         </w:tc>
@@ -1506,7 +1506,7 @@
                 <w:sz w:val="19"/>
                 <w:lang w:val="es-CO"/>
               </w:rPr>
-              <w:t xml:space="preserve">feat: especificación única del modelo de datos y generadores (DDL, datos, diagramas, álgebra)</w:t>
+              <w:t xml:space="preserve">docs: entregables de la fase 1 (propuesta, supuestos, modelos, diccionario y algebra)</w:t>
             </w:r>
           </w:p>
         </w:tc>
@@ -1523,7 +1523,7 @@
                 <w:sz w:val="19"/>
                 <w:lang w:val="es-CO"/>
               </w:rPr>
-              <w:t xml:space="preserve">74a68e3</w:t>
+              <w:t xml:space="preserve">ed5428c</w:t>
             </w:r>
           </w:p>
         </w:tc>
@@ -1553,7 +1553,7 @@
                 <w:sz w:val="19"/>
                 <w:lang w:val="es-CO"/>
               </w:rPr>
-              <w:t xml:space="preserve">docs: herramienta Markdown→Word con portada institucional y plantilla de estilos</w:t>
+              <w:t xml:space="preserve">feat: scripts de creacion de usuarios, tablas, vistas, funciones y disparadores</w:t>
             </w:r>
           </w:p>
         </w:tc>
@@ -1570,7 +1570,7 @@
                 <w:sz w:val="19"/>
                 <w:lang w:val="es-CO"/>
               </w:rPr>
-              <w:t xml:space="preserve">3ad84cd</w:t>
+              <w:t xml:space="preserve">8944cc4</w:t>
             </w:r>
           </w:p>
         </w:tc>
@@ -1600,7 +1600,7 @@
                 <w:sz w:val="19"/>
                 <w:lang w:val="es-CO"/>
               </w:rPr>
-              <w:t xml:space="preserve">docs: diagramas Chen, EER, Barker, Crow’s Foot, relacional, EDT y cronograma</w:t>
+              <w:t xml:space="preserve">feat: scripts de insercion de registros de prueba</w:t>
             </w:r>
           </w:p>
         </w:tc>
@@ -1617,7 +1617,7 @@
                 <w:sz w:val="19"/>
                 <w:lang w:val="es-CO"/>
               </w:rPr>
-              <w:t xml:space="preserve">2bf9e49</w:t>
+              <w:t xml:space="preserve">333f716</w:t>
             </w:r>
           </w:p>
         </w:tc>
@@ -1647,7 +1647,7 @@
                 <w:sz w:val="19"/>
                 <w:lang w:val="es-CO"/>
               </w:rPr>
-              <w:t xml:space="preserve">docs: entregables de la Fase 1 (propuesta, supuestos, modelos, diccionario, álgebra)</w:t>
+              <w:t xml:space="preserve">feat: consultas de algebra, verificacion, permisos y script maestro</w:t>
             </w:r>
           </w:p>
         </w:tc>
@@ -1664,7 +1664,7 @@
                 <w:sz w:val="19"/>
                 <w:lang w:val="es-CO"/>
               </w:rPr>
-              <w:t xml:space="preserve">d9c6a6f</w:t>
+              <w:t xml:space="preserve">8e501a7</w:t>
             </w:r>
           </w:p>
         </w:tc>
@@ -1694,7 +1694,7 @@
                 <w:sz w:val="19"/>
                 <w:lang w:val="es-CO"/>
               </w:rPr>
-              <w:t xml:space="preserve">feat: scripts Oracle de creación de objetos, inserción de registros y varios</w:t>
+              <w:t xml:space="preserve">feat: scripts de la maquina virtual para instalar oracle y cargar la base</w:t>
             </w:r>
           </w:p>
         </w:tc>
@@ -1711,7 +1711,7 @@
                 <w:sz w:val="19"/>
                 <w:lang w:val="es-CO"/>
               </w:rPr>
-              <w:t xml:space="preserve">568c2ed</w:t>
+              <w:t xml:space="preserve">025d856</w:t>
             </w:r>
           </w:p>
         </w:tc>
@@ -1741,7 +1741,7 @@
                 <w:sz w:val="19"/>
                 <w:lang w:val="es-CO"/>
               </w:rPr>
-              <w:t xml:space="preserve">feat: máquina virtual Oracle Linux 9 (Lima) e instalación de Oracle AI Database 26ai Free</w:t>
+              <w:t xml:space="preserve">docs: evidencias de la instalacion en la VM</w:t>
             </w:r>
           </w:p>
         </w:tc>
@@ -1758,7 +1758,7 @@
                 <w:sz w:val="19"/>
                 <w:lang w:val="es-CO"/>
               </w:rPr>
-              <w:t xml:space="preserve">59e54e8</w:t>
+              <w:t xml:space="preserve">a319b1c</w:t>
             </w:r>
           </w:p>
         </w:tc>
@@ -1788,7 +1788,7 @@
                 <w:sz w:val="19"/>
                 <w:lang w:val="es-CO"/>
               </w:rPr>
-              <w:t xml:space="preserve">feat: aplicación web Flask de consulta conectada a Oracle (solo lectura)</w:t>
+              <w:t xml:space="preserve">feat: aplicacion web en flask conectada a oracle (solo lectura)</w:t>
             </w:r>
           </w:p>
         </w:tc>
@@ -1805,7 +1805,7 @@
                 <w:sz w:val="19"/>
                 <w:lang w:val="es-CO"/>
               </w:rPr>
-              <w:t xml:space="preserve">51d7a32</w:t>
+              <w:t xml:space="preserve">7b708a6</w:t>
             </w:r>
           </w:p>
         </w:tc>
@@ -1835,54 +1835,7 @@
                 <w:sz w:val="19"/>
                 <w:lang w:val="es-CO"/>
               </w:rPr>
-              <w:t xml:space="preserve">docs: documentos de la Fase 2 y entregables transversales con sus pruebas</w:t>
-            </w:r>
-          </w:p>
-        </w:tc>
-      </w:tr>
-      <w:tr>
-        <w:tc>
-          <w:tcPr/>
-          <w:p>
-            <w:pPr>
-              <w:pStyle w:val="Compact"/>
-            </w:pPr>
-            <w:r>
-              <w:rPr>
-                <w:sz w:val="19"/>
-                <w:lang w:val="es-CO"/>
-              </w:rPr>
-              <w:t xml:space="preserve">dd93800</w:t>
-            </w:r>
-          </w:p>
-        </w:tc>
-        <w:tc>
-          <w:tcPr/>
-          <w:p>
-            <w:pPr>
-              <w:pStyle w:val="Compact"/>
-            </w:pPr>
-            <w:r>
-              <w:rPr>
-                <w:sz w:val="19"/>
-                <w:lang w:val="es-CO"/>
-              </w:rPr>
-              <w:t xml:space="preserve">Juan David Polo Herrera</w:t>
-            </w:r>
-          </w:p>
-        </w:tc>
-        <w:tc>
-          <w:tcPr/>
-          <w:p>
-            <w:pPr>
-              <w:pStyle w:val="Compact"/>
-            </w:pPr>
-            <w:r>
-              <w:rPr>
-                <w:sz w:val="19"/>
-                <w:lang w:val="es-CO"/>
-              </w:rPr>
-              <w:t xml:space="preserve">chore: excluir configuración local de herramientas</w:t>
+              <w:t xml:space="preserve">docs: documentos de la fase 2 y transversales</w:t>
             </w:r>
           </w:p>
         </w:tc>

</xml_diff>

<commit_message>
docs: historial de commits actualizado
</commit_message>
<xml_diff>
--- a/documentos/fase2/07_Repositorio_GitHub.docx
+++ b/documentos/fase2/07_Repositorio_GitHub.docx
@@ -1851,6 +1851,241 @@
                 <w:lang w:val="es-CO"/>
               </w:rPr>
               <w:t xml:space="preserve">docs: documentos de la fase 2 y transversales</w:t>
+            </w:r>
+          </w:p>
+        </w:tc>
+      </w:tr>
+      <w:tr>
+        <w:tc>
+          <w:tcPr/>
+          <w:p>
+            <w:pPr>
+              <w:pStyle w:val="Compact"/>
+            </w:pPr>
+            <w:r>
+              <w:rPr>
+                <w:sz w:val="19"/>
+                <w:lang w:val="es-CO"/>
+              </w:rPr>
+              <w:t xml:space="preserve">39dca6a</w:t>
+            </w:r>
+          </w:p>
+        </w:tc>
+        <w:tc>
+          <w:tcPr/>
+          <w:p>
+            <w:pPr>
+              <w:pStyle w:val="Compact"/>
+            </w:pPr>
+            <w:r>
+              <w:rPr>
+                <w:sz w:val="19"/>
+                <w:lang w:val="es-CO"/>
+              </w:rPr>
+              <w:t xml:space="preserve">Juan David Polo Herrera</w:t>
+            </w:r>
+          </w:p>
+        </w:tc>
+        <w:tc>
+          <w:tcPr/>
+          <w:p>
+            <w:pPr>
+              <w:pStyle w:val="Compact"/>
+            </w:pPr>
+            <w:r>
+              <w:rPr>
+                <w:sz w:val="19"/>
+                <w:lang w:val="es-CO"/>
+              </w:rPr>
+              <w:t xml:space="preserve">docs: actualizar documentos con el historial del repositorio</w:t>
+            </w:r>
+          </w:p>
+        </w:tc>
+      </w:tr>
+      <w:tr>
+        <w:tc>
+          <w:tcPr/>
+          <w:p>
+            <w:pPr>
+              <w:pStyle w:val="Compact"/>
+            </w:pPr>
+            <w:r>
+              <w:rPr>
+                <w:sz w:val="19"/>
+                <w:lang w:val="es-CO"/>
+              </w:rPr>
+              <w:t xml:space="preserve">aa17468</w:t>
+            </w:r>
+          </w:p>
+        </w:tc>
+        <w:tc>
+          <w:tcPr/>
+          <w:p>
+            <w:pPr>
+              <w:pStyle w:val="Compact"/>
+            </w:pPr>
+            <w:r>
+              <w:rPr>
+                <w:sz w:val="19"/>
+                <w:lang w:val="es-CO"/>
+              </w:rPr>
+              <w:t xml:space="preserve">Juan David Polo Herrera</w:t>
+            </w:r>
+          </w:p>
+        </w:tc>
+        <w:tc>
+          <w:tcPr/>
+          <w:p>
+            <w:pPr>
+              <w:pStyle w:val="Compact"/>
+            </w:pPr>
+            <w:r>
+              <w:rPr>
+                <w:sz w:val="19"/>
+                <w:lang w:val="es-CO"/>
+              </w:rPr>
+              <w:t xml:space="preserve">fix: disparador de consulta tambien valida UPDATE, ajustes de scripts y textos</w:t>
+            </w:r>
+          </w:p>
+        </w:tc>
+      </w:tr>
+      <w:tr>
+        <w:tc>
+          <w:tcPr/>
+          <w:p>
+            <w:pPr>
+              <w:pStyle w:val="Compact"/>
+            </w:pPr>
+            <w:r>
+              <w:rPr>
+                <w:sz w:val="19"/>
+                <w:lang w:val="es-CO"/>
+              </w:rPr>
+              <w:t xml:space="preserve">26d306c</w:t>
+            </w:r>
+          </w:p>
+        </w:tc>
+        <w:tc>
+          <w:tcPr/>
+          <w:p>
+            <w:pPr>
+              <w:pStyle w:val="Compact"/>
+            </w:pPr>
+            <w:r>
+              <w:rPr>
+                <w:sz w:val="19"/>
+                <w:lang w:val="es-CO"/>
+              </w:rPr>
+              <w:t xml:space="preserve">Juan David Polo Herrera</w:t>
+            </w:r>
+          </w:p>
+        </w:tc>
+        <w:tc>
+          <w:tcPr/>
+          <w:p>
+            <w:pPr>
+              <w:pStyle w:val="Compact"/>
+            </w:pPr>
+            <w:r>
+              <w:rPr>
+                <w:sz w:val="19"/>
+                <w:lang w:val="es-CO"/>
+              </w:rPr>
+              <w:t xml:space="preserve">feat: migrar la aplicacion web a java con spring boot y jdbc (sin orm)</w:t>
+            </w:r>
+          </w:p>
+        </w:tc>
+      </w:tr>
+      <w:tr>
+        <w:tc>
+          <w:tcPr/>
+          <w:p>
+            <w:pPr>
+              <w:pStyle w:val="Compact"/>
+            </w:pPr>
+            <w:r>
+              <w:rPr>
+                <w:sz w:val="19"/>
+                <w:lang w:val="es-CO"/>
+              </w:rPr>
+              <w:t xml:space="preserve">adb6f4f</w:t>
+            </w:r>
+          </w:p>
+        </w:tc>
+        <w:tc>
+          <w:tcPr/>
+          <w:p>
+            <w:pPr>
+              <w:pStyle w:val="Compact"/>
+            </w:pPr>
+            <w:r>
+              <w:rPr>
+                <w:sz w:val="19"/>
+                <w:lang w:val="es-CO"/>
+              </w:rPr>
+              <w:t xml:space="preserve">Juan David Polo Herrera</w:t>
+            </w:r>
+          </w:p>
+        </w:tc>
+        <w:tc>
+          <w:tcPr/>
+          <w:p>
+            <w:pPr>
+              <w:pStyle w:val="Compact"/>
+            </w:pPr>
+            <w:r>
+              <w:rPr>
+                <w:sz w:val="19"/>
+                <w:lang w:val="es-CO"/>
+              </w:rPr>
+              <w:t xml:space="preserve">feat: instalar la app java como servicio en la VM y prueba del usuario VET_APP</w:t>
+            </w:r>
+          </w:p>
+        </w:tc>
+      </w:tr>
+      <w:tr>
+        <w:tc>
+          <w:tcPr/>
+          <w:p>
+            <w:pPr>
+              <w:pStyle w:val="Compact"/>
+            </w:pPr>
+            <w:r>
+              <w:rPr>
+                <w:sz w:val="19"/>
+                <w:lang w:val="es-CO"/>
+              </w:rPr>
+              <w:t xml:space="preserve">3ef9058</w:t>
+            </w:r>
+          </w:p>
+        </w:tc>
+        <w:tc>
+          <w:tcPr/>
+          <w:p>
+            <w:pPr>
+              <w:pStyle w:val="Compact"/>
+            </w:pPr>
+            <w:r>
+              <w:rPr>
+                <w:sz w:val="19"/>
+                <w:lang w:val="es-CO"/>
+              </w:rPr>
+              <w:t xml:space="preserve">Juan David Polo Herrera</w:t>
+            </w:r>
+          </w:p>
+        </w:tc>
+        <w:tc>
+          <w:tcPr/>
+          <w:p>
+            <w:pPr>
+              <w:pStyle w:val="Compact"/>
+            </w:pPr>
+            <w:r>
+              <w:rPr>
+                <w:sz w:val="19"/>
+                <w:lang w:val="es-CO"/>
+              </w:rPr>
+              <w:t xml:space="preserve">docs: actualizar documentos a la aplicacion en java</w:t>
             </w:r>
           </w:p>
         </w:tc>

</xml_diff>